<commit_message>
Update Sprint Planning documents
Updated Sprint Planning files:
- Sprint_Planning_S1.docx
- Sprint_Planning_S2.docx
- Sprint_Planning_S8.docx
- Sprint_Planning_S9.docx

Changes: Updated project documentation for Sprints 1, 2, 8, and 9
</commit_message>
<xml_diff>
--- a/Docs/Sprint01/Sprint_Planning_S1.docx
+++ b/Docs/Sprint01/Sprint_Planning_S1.docx
@@ -236,14 +236,8 @@
     </w:tbl>
     <w:p>
       <w:pPr>
-        <w:spacing w:before="100" w:beforeAutospacing="1" w:after="100" w:afterAutospacing="1" w:line="240" w:lineRule="auto"/>
-        <w:outlineLvl w:val="2"/>
         <w:rPr>
-          <w:rFonts w:ascii="Times New Roman" w:eastAsia="Times New Roman" w:hAnsi="Times New Roman" w:cs="Times New Roman"/>
-          <w:b/>
-          <w:bCs/>
-          <w:sz w:val="27"/>
-          <w:szCs w:val="27"/>
+          <w:lang w:val="vi-VN"/>
         </w:rPr>
       </w:pPr>
     </w:p>
@@ -1952,28 +1946,14 @@
     </w:tbl>
     <w:p>
       <w:pPr>
-        <w:spacing w:before="100" w:beforeAutospacing="1" w:after="100" w:afterAutospacing="1" w:line="240" w:lineRule="auto"/>
-        <w:outlineLvl w:val="2"/>
         <w:rPr>
-          <w:rFonts w:ascii="Times New Roman" w:eastAsia="Times New Roman" w:hAnsi="Times New Roman" w:cs="Times New Roman"/>
-          <w:b/>
-          <w:bCs/>
-          <w:sz w:val="27"/>
-          <w:szCs w:val="27"/>
           <w:lang w:val="vi-VN"/>
         </w:rPr>
       </w:pPr>
     </w:p>
     <w:p>
       <w:pPr>
-        <w:spacing w:before="100" w:beforeAutospacing="1" w:after="100" w:afterAutospacing="1" w:line="240" w:lineRule="auto"/>
-        <w:outlineLvl w:val="2"/>
         <w:rPr>
-          <w:rFonts w:ascii="Times New Roman" w:eastAsia="Times New Roman" w:hAnsi="Times New Roman" w:cs="Times New Roman"/>
-          <w:b/>
-          <w:bCs/>
-          <w:sz w:val="27"/>
-          <w:szCs w:val="27"/>
           <w:lang w:val="vi-VN"/>
         </w:rPr>
       </w:pPr>
@@ -3756,28 +3736,14 @@
     </w:tbl>
     <w:p>
       <w:pPr>
-        <w:spacing w:before="100" w:beforeAutospacing="1" w:after="100" w:afterAutospacing="1" w:line="240" w:lineRule="auto"/>
-        <w:outlineLvl w:val="2"/>
         <w:rPr>
-          <w:rFonts w:ascii="Times New Roman" w:eastAsia="Times New Roman" w:hAnsi="Times New Roman" w:cs="Times New Roman"/>
-          <w:b/>
-          <w:bCs/>
-          <w:sz w:val="27"/>
-          <w:szCs w:val="27"/>
           <w:lang w:val="vi-VN"/>
         </w:rPr>
       </w:pPr>
     </w:p>
     <w:p>
       <w:pPr>
-        <w:spacing w:before="100" w:beforeAutospacing="1" w:after="100" w:afterAutospacing="1" w:line="240" w:lineRule="auto"/>
-        <w:outlineLvl w:val="2"/>
         <w:rPr>
-          <w:rFonts w:ascii="Times New Roman" w:eastAsia="Times New Roman" w:hAnsi="Times New Roman" w:cs="Times New Roman"/>
-          <w:b/>
-          <w:bCs/>
-          <w:sz w:val="27"/>
-          <w:szCs w:val="27"/>
           <w:lang w:val="vi-VN"/>
         </w:rPr>
       </w:pPr>
@@ -3819,6 +3785,7 @@
           <w:rFonts w:ascii="Times New Roman" w:eastAsia="Times New Roman" w:hAnsi="Times New Roman" w:cs="Times New Roman"/>
           <w:sz w:val="24"/>
           <w:szCs w:val="24"/>
+          <w:lang w:val="vi-VN"/>
         </w:rPr>
       </w:pPr>
       <w:r>
@@ -3826,6 +3793,7 @@
           <w:rFonts w:ascii="Times New Roman" w:eastAsia="Times New Roman" w:hAnsi="Times New Roman" w:cs="Times New Roman"/>
           <w:sz w:val="24"/>
           <w:szCs w:val="24"/>
+          <w:lang w:val="vi-VN"/>
         </w:rPr>
         <w:t>Rủi ro:</w:t>
       </w:r>
@@ -3859,6 +3827,7 @@
           <w:rFonts w:ascii="Times New Roman" w:eastAsia="Times New Roman" w:hAnsi="Times New Roman" w:cs="Times New Roman"/>
           <w:sz w:val="24"/>
           <w:szCs w:val="24"/>
+          <w:lang w:val="vi-VN"/>
         </w:rPr>
       </w:pPr>
       <w:r>
@@ -3866,6 +3835,7 @@
           <w:rFonts w:ascii="Times New Roman" w:eastAsia="Times New Roman" w:hAnsi="Times New Roman" w:cs="Times New Roman"/>
           <w:sz w:val="24"/>
           <w:szCs w:val="24"/>
+          <w:lang w:val="vi-VN"/>
         </w:rPr>
         <w:t>Biện pháp:</w:t>
       </w:r>

</xml_diff>